<commit_message>
fix: writers keep styles, numbers and headers at their limits
- DOCX merges a footnote's style and an admonition's border into a paragraph's
  own properties, in Word's order; they were lost on paragraphs with spacing.
- DOCX and ODT write a list level's parent numbers as text where its parents are
  in no list of its own (a PDF's levels).
- The native PDF engine draws a PDF's running headers and footers on their own
  pages; they carry the page they were read from (HeaderFooterMetadata.page).
- A running header is one with something in it; a document's page too small or
  too large to write on is A4.
- A drawing node holding nodes writes them; a marker is cut at a whole
  character; the HTML PDF engine takes 'auto' with a size given.
- The CLI's csvDelimiter 'auto' leaves CSV output to write the delimiter read.
</commit_message>
<xml_diff>
--- a/test/generator/baseline/gen.pdf.to.docx.docx
+++ b/test/generator/baseline/gen.pdf.to.docx.docx
@@ -4229,7 +4229,7 @@
     <w:lvl w:ilvl="1">
       <w:start w:val="1"/>
       <w:numFmt w:val="decimal"/>
-      <w:lvlText w:val="%1.%2."/>
+      <w:lvlText w:val="1.%2."/>
       <w:lvlJc w:val="left"/>
       <w:pPr>
         <w:ind w:left="1440" w:hanging="360"/>
@@ -4322,7 +4322,7 @@
     <w:lvl w:ilvl="2">
       <w:start w:val="1"/>
       <w:numFmt w:val="decimal"/>
-      <w:lvlText w:val="%1.%2.%3."/>
+      <w:lvlText w:val="1.1.%3."/>
       <w:lvlJc w:val="left"/>
       <w:pPr>
         <w:ind w:left="2160" w:hanging="360"/>

</xml_diff>

<commit_message>
feat(pdf): table cells read with the shading they were set on
Each cell takes the colour of the smallest coloured rectangle under its middle, for tagged tables and for those read from their rules or their text alike: a header row's white text was read on no colour, and written invisible.
</commit_message>
<xml_diff>
--- a/test/generator/baseline/gen.pdf.to.docx.docx
+++ b/test/generator/baseline/gen.pdf.to.docx.docx
@@ -528,6 +528,7 @@
         <w:tc>
           <w:tcPr>
             <w:tcW w:w="0" w:type="auto"/>
+            <w:shd w:val="clear" w:color="auto" w:fill="9BBB59"/>
           </w:tcPr>
           <w:p>
             <w:r>
@@ -544,6 +545,7 @@
         <w:tc>
           <w:tcPr>
             <w:tcW w:w="0" w:type="auto"/>
+            <w:shd w:val="clear" w:color="auto" w:fill="9BBB59"/>
           </w:tcPr>
           <w:p>
             <w:r>
@@ -925,6 +927,7 @@
         <w:tc>
           <w:tcPr>
             <w:tcW w:w="0" w:type="auto"/>
+            <w:shd w:val="clear" w:color="auto" w:fill="D3DFEE"/>
           </w:tcPr>
           <w:p>
             <w:r>
@@ -1041,6 +1044,7 @@
         <w:tc>
           <w:tcPr>
             <w:tcW w:w="0" w:type="auto"/>
+            <w:shd w:val="clear" w:color="auto" w:fill="D3DFEE"/>
           </w:tcPr>
           <w:p>
             <w:r>
@@ -1055,6 +1059,7 @@
         <w:tc>
           <w:tcPr>
             <w:tcW w:w="0" w:type="auto"/>
+            <w:shd w:val="clear" w:color="auto" w:fill="D3DFEE"/>
           </w:tcPr>
           <w:p>
             <w:r>
@@ -1069,6 +1074,7 @@
         <w:tc>
           <w:tcPr>
             <w:tcW w:w="0" w:type="auto"/>
+            <w:shd w:val="clear" w:color="auto" w:fill="D3DFEE"/>
           </w:tcPr>
           <w:p>
             <w:r>
@@ -1189,6 +1195,7 @@
         <w:tc>
           <w:tcPr>
             <w:tcW w:w="0" w:type="auto"/>
+            <w:shd w:val="clear" w:color="auto" w:fill="D3DFEE"/>
           </w:tcPr>
           <w:p>
             <w:r>
@@ -1203,6 +1210,7 @@
         <w:tc>
           <w:tcPr>
             <w:tcW w:w="0" w:type="auto"/>
+            <w:shd w:val="clear" w:color="auto" w:fill="D3DFEE"/>
           </w:tcPr>
           <w:p>
             <w:r>
@@ -1217,6 +1225,7 @@
         <w:tc>
           <w:tcPr>
             <w:tcW w:w="0" w:type="auto"/>
+            <w:shd w:val="clear" w:color="auto" w:fill="D3DFEE"/>
           </w:tcPr>
           <w:p>
             <w:r>
@@ -1231,6 +1240,7 @@
         <w:tc>
           <w:tcPr>
             <w:tcW w:w="0" w:type="auto"/>
+            <w:shd w:val="clear" w:color="auto" w:fill="D3DFEE"/>
           </w:tcPr>
           <w:p>
             <w:r>
@@ -1245,6 +1255,7 @@
         <w:tc>
           <w:tcPr>
             <w:tcW w:w="0" w:type="auto"/>
+            <w:shd w:val="clear" w:color="auto" w:fill="D3DFEE"/>
           </w:tcPr>
           <w:p>
             <w:r>
@@ -1300,6 +1311,7 @@
         <w:tc>
           <w:tcPr>
             <w:tcW w:w="0" w:type="auto"/>
+            <w:shd w:val="clear" w:color="auto" w:fill="4BACC6"/>
           </w:tcPr>
           <w:p>
             <w:r>
@@ -1316,6 +1328,7 @@
         <w:tc>
           <w:tcPr>
             <w:tcW w:w="0" w:type="auto"/>
+            <w:shd w:val="clear" w:color="auto" w:fill="4BACC6"/>
           </w:tcPr>
           <w:p>
             <w:r>
@@ -1332,6 +1345,7 @@
         <w:tc>
           <w:tcPr>
             <w:tcW w:w="0" w:type="auto"/>
+            <w:shd w:val="clear" w:color="auto" w:fill="4BACC6"/>
           </w:tcPr>
           <w:p>
             <w:r>
@@ -1357,6 +1371,7 @@
         <w:tc>
           <w:tcPr>
             <w:tcW w:w="0" w:type="auto"/>
+            <w:shd w:val="clear" w:color="auto" w:fill="4BACC6"/>
           </w:tcPr>
           <w:p>
             <w:r>

</xml_diff>

<commit_message>
fix(pdf): a blank before or after a line's text is no part of its place
The space a producer draws before a cell's text, or after a line's last word, widened the box of the text beside it: a cell's number was placed where the cell before it ended, and a line ran past its last word.
</commit_message>
<xml_diff>
--- a/test/generator/baseline/gen.pdf.to.docx.docx
+++ b/test/generator/baseline/gen.pdf.to.docx.docx
@@ -276,15 +276,7 @@
           <w:rFonts w:ascii="Ubuntu-Regular" w:hAnsi="Ubuntu-Regular"/>
           <w:sz w:val="24"/>
         </w:rPr>
-        <w:t xml:space="preserve">A paragraph with styled text:</w:t>
-      </w:r>
-      <w:r>
-        <w:rPr>
-          <w:rFonts w:ascii="Ubuntu-Regular" w:hAnsi="Ubuntu-Regular"/>
-          <w:color w:val="808080"/>
-          <w:sz w:val="24"/>
-        </w:rPr>
-        <w:t xml:space="preserve"> </w:t>
+        <w:t xml:space="preserve">A paragraph with styled text: </w:t>
       </w:r>
       <w:r>
         <w:rPr>
@@ -3033,18 +3025,9 @@
           <w:rFonts w:ascii="Ubuntu-Regular" w:hAnsi="Ubuntu-Regular"/>
           <w:sz w:val="24"/>
         </w:rPr>
-        <w:t xml:space="preserve">example, here is a link pointing to the</w:t>
+        <w:t xml:space="preserve">example, here is a link pointing to the </w:t>
       </w:r>
       <w:hyperlink r:id="rId1">
-        <w:r>
-          <w:rPr>
-            <w:rStyle w:val="Hyperlink"/>
-            <w:rFonts w:ascii="Ubuntu-Regular" w:hAnsi="Ubuntu-Regular"/>
-            <w:color w:val="0000FF"/>
-            <w:sz w:val="24"/>
-          </w:rPr>
-          <w:t xml:space="preserve"> </w:t>
-        </w:r>
         <w:r>
           <w:rPr>
             <w:rStyle w:val="Hyperlink"/>
@@ -3066,18 +3049,9 @@
           <w:rFonts w:ascii="Ubuntu-Regular" w:hAnsi="Ubuntu-Regular"/>
           <w:sz w:val="24"/>
         </w:rPr>
-        <w:t xml:space="preserve">points back to the section on</w:t>
+        <w:t xml:space="preserve">points back to the section on </w:t>
       </w:r>
       <w:hyperlink w:anchor="paragraph_level_formatting">
-        <w:r>
-          <w:rPr>
-            <w:rStyle w:val="Hyperlink"/>
-            <w:rFonts w:ascii="Ubuntu-Regular" w:hAnsi="Ubuntu-Regular"/>
-            <w:color w:val="0000FF"/>
-            <w:sz w:val="24"/>
-          </w:rPr>
-          <w:t xml:space="preserve"> </w:t>
-        </w:r>
         <w:r>
           <w:rPr>
             <w:rStyle w:val="Hyperlink"/>
@@ -3445,15 +3419,7 @@
           <w:rFonts w:ascii="Ubuntu-Regular" w:hAnsi="Ubuntu-Regular"/>
           <w:sz w:val="24"/>
         </w:rPr>
-        <w:t xml:space="preserve">was</w:t>
-      </w:r>
-      <w:r>
-        <w:rPr>
-          <w:rFonts w:ascii="Ubuntu-Regular" w:hAnsi="Ubuntu-Regular"/>
-          <w:color w:val="808080"/>
-          <w:sz w:val="24"/>
-        </w:rPr>
-        <w:t xml:space="preserve"> </w:t>
+        <w:t xml:space="preserve">was </w:t>
       </w:r>
       <w:r>
         <w:rPr>

</xml_diff>